<commit_message>
Update the client handbook for this session's features
Documents self-service password/email changes, admin-posted requests
and school enquiries, the 30-day rejected-request auto-delete, and the
realtime full-page messaging redesign.

Co-Authored-By: Claude Sonnet 5 <noreply@anthropic.com>
</commit_message>
<xml_diff>
--- a/docs/08_Tuition_Serve_Client_Guide.docx
+++ b/docs/08_Tuition_Serve_Client_Guide.docx
@@ -473,6 +473,35 @@
     </w:p>
     <w:p>
       <w:pPr>
+        <w:pStyle w:val="Heading3"/>
+      </w:pPr>
+      <w:r>
+        <w:t>Account Self-Service: Passwords and Email</w:t>
+      </w:r>
+    </w:p>
+    <w:p>
+      <w:r>
+        <w:t xml:space="preserve">Tutors and admins no longer need you to intervene for routine account changes. On the sign-in page, a </w:t>
+      </w:r>
+      <w:r>
+        <w:t>“Forgot password?”</w:t>
+      </w:r>
+      <w:r>
+        <w:t xml:space="preserve"> link sends a password-reset email directly through Firebase — you are not involved, and you can never see or set anyone's password yourself.</w:t>
+      </w:r>
+    </w:p>
+    <w:p>
+      <w:r>
+        <w:t>Once signed in, every role's own Profile page has a Security section where they can change their password (after confirming their current one) or change their email address. A change of email takes effect immediately and becomes their login email from that point on.</w:t>
+      </w:r>
+    </w:p>
+    <w:p>
+      <w:r>
+        <w:t>Accounts that signed up with Google instead of a password see a note pointing them to their Google Account instead — there's no password on file here for them to change.</w:t>
+      </w:r>
+    </w:p>
+    <w:p>
+      <w:pPr>
         <w:pStyle w:val="Heading1"/>
       </w:pPr>
       <w:r>
@@ -494,7 +523,7 @@
           <w:b w:val="0"/>
           <w:i w:val="0"/>
         </w:rPr>
-        <w:t>Contact details, the student's grade, subject, location down to the ward level, exact address (kept private), and availability. No account created.</w:t>
+        <w:t>Contact details, the student's grade (Play Group through Grade 12, or Bachelor Level), subject, location down to the ward level, exact address (kept private), and availability. No account created.</w:t>
       </w:r>
     </w:p>
     <w:p>
@@ -608,6 +637,62 @@
     <w:p>
       <w:r>
         <w:br w:type="page"/>
+      </w:r>
+    </w:p>
+    <w:p>
+      <w:pPr>
+        <w:pStyle w:val="Heading3"/>
+      </w:pPr>
+      <w:r>
+        <w:t>Requests an Admin Enters Directly</w:t>
+      </w:r>
+    </w:p>
+    <w:p>
+      <w:r>
+        <w:t xml:space="preserve">Not every parent uses the website — some call or message the branch directly. An admin can enter that request on the parent's behalf from Tuition Requests → </w:t>
+      </w:r>
+      <w:r>
+        <w:rPr>
+          <w:rFonts w:ascii="Consolas" w:hAnsi="Consolas"/>
+          <w:sz w:val="21"/>
+        </w:rPr>
+        <w:t>Post Tuition</w:t>
+      </w:r>
+      <w:r>
+        <w:t xml:space="preserve">; it lands in the same New Requests queue as a normal submission and goes through the same confirm/reject flow. The equivalent exists for schools: Admin → School Contact → </w:t>
+      </w:r>
+      <w:r>
+        <w:rPr>
+          <w:rFonts w:ascii="Consolas" w:hAnsi="Consolas"/>
+          <w:sz w:val="21"/>
+        </w:rPr>
+        <w:t>Post School Enquiry</w:t>
+      </w:r>
+      <w:r>
+        <w:t xml:space="preserve"> creates a school partnership enquiry exactly as if the school had used the For Schools page themselves.</w:t>
+      </w:r>
+    </w:p>
+    <w:p>
+      <w:pPr>
+        <w:pStyle w:val="Heading3"/>
+      </w:pPr>
+      <w:r>
+        <w:t>Rejected Requests Clean Themselves Up</w:t>
+      </w:r>
+    </w:p>
+    <w:p>
+      <w:r>
+        <w:t xml:space="preserve">A rejected request is kept for 30 days, in case anyone needs to review why, then deleted automatically by a scheduled job. An admin can also clear all of a branch's rejected requests immediately from the </w:t>
+      </w:r>
+      <w:r>
+        <w:rPr>
+          <w:rFonts w:ascii="Consolas" w:hAnsi="Consolas"/>
+          <w:sz w:val="21"/>
+        </w:rPr>
+        <w:t>Rejected</w:t>
+      </w:r>
+      <w:r>
+        <w:t xml:space="preserve"> tab, without waiting.</w:t>
       </w:r>
     </w:p>
     <w:p>
@@ -893,7 +978,7 @@
           <w:b w:val="0"/>
           <w:i w:val="0"/>
         </w:rPr>
-        <w:t>There is one conversation per tutor/branch pair — a focused thread, not a general chat system. Either side can start it, from either the Applicants list on a tuition request or the Messages section directly.</w:t>
+        <w:t>There is one conversation per tutor/branch pair — a focused thread, not a general chat system. Either side can start it, from either the Applicants list on a tuition request or the Messages section directly. Messages arrive in real time on both sides — nothing needs refreshing — and the Messages section itself is a single page split into a conversation list and the open thread, side by side on a wide screen and one at a time on a phone, the way a modern chat app works.</w:t>
       </w:r>
     </w:p>
     <w:p>
@@ -917,6 +1002,39 @@
     <w:p>
       <w:r>
         <w:br w:type="page"/>
+      </w:r>
+    </w:p>
+    <w:p>
+      <w:pPr>
+        <w:pStyle w:val="Heading3"/>
+      </w:pPr>
+      <w:r>
+        <w:t>Contact Queries and School Enquiries</w:t>
+      </w:r>
+    </w:p>
+    <w:p>
+      <w:r>
+        <w:t xml:space="preserve">Separate from tutor messaging, two public forms feed their own admin inboxes: the general Contact Us form (Admin → </w:t>
+      </w:r>
+      <w:r>
+        <w:rPr>
+          <w:rFonts w:ascii="Consolas" w:hAnsi="Consolas"/>
+          <w:sz w:val="21"/>
+        </w:rPr>
+        <w:t>Contact Queries</w:t>
+      </w:r>
+      <w:r>
+        <w:t xml:space="preserve">) and the For Schools partnership form (Admin → </w:t>
+      </w:r>
+      <w:r>
+        <w:rPr>
+          <w:rFonts w:ascii="Consolas" w:hAnsi="Consolas"/>
+          <w:sz w:val="21"/>
+        </w:rPr>
+        <w:t>School Contact</w:t>
+      </w:r>
+      <w:r>
+        <w:t>). Both let an admin reply by email and are marked read once opened. An admin can also log one of these on someone's behalf — see “Requests an Admin Enters Directly” above.</w:t>
       </w:r>
     </w:p>
     <w:p>

</xml_diff>

<commit_message>
feat: add district and municipality coverage routing to branches
- Update Branch domain model to include structured coverage for districts and municipalities
- Enhance resolveBranchIdForLocation to route by whole district or specific municipalities with legacy city fallback
- Add BranchCoveragePicker component and integrate with new admin/branch creation form
- Add BranchCoverageCard on branch detail page allowing Super Admin to edit existing branch coverage
- Implement updateBranchCoverage and setBranchStatus server actions
- Add unit tests for district and municipality branch routing with 100% pass rate
</commit_message>
<xml_diff>
--- a/docs/08_Tuition_Serve_Client_Guide.docx
+++ b/docs/08_Tuition_Serve_Client_Guide.docx
@@ -72,7 +72,7 @@
           <w:color w:val="4B5563"/>
           <w:sz w:val="20"/>
         </w:rPr>
-        <w:t>First Edition</w:t>
+        <w:t>Second Edition — Updated September 2026</w:t>
       </w:r>
     </w:p>
     <w:p>
@@ -460,6 +460,38 @@
           </w:p>
         </w:tc>
       </w:tr>
+      <w:tr>
+        <w:tc>
+          <w:tcPr>
+            <w:tcW w:type="dxa" w:w="2880"/>
+          </w:tcPr>
+          <w:p>
+            <w:r>
+              <w:t>School / Institution</w:t>
+            </w:r>
+          </w:p>
+        </w:tc>
+        <w:tc>
+          <w:tcPr>
+            <w:tcW w:type="dxa" w:w="2880"/>
+          </w:tcPr>
+          <w:p>
+            <w:r>
+              <w:t>No — public form or direct contact</w:t>
+            </w:r>
+          </w:p>
+        </w:tc>
+        <w:tc>
+          <w:tcPr>
+            <w:tcW w:type="dxa" w:w="2880"/>
+          </w:tcPr>
+          <w:p>
+            <w:r>
+              <w:t>Submits partnership enquiries; can have teacher vacancies posted on their behalf by an admin.</w:t>
+            </w:r>
+          </w:p>
+        </w:tc>
+      </w:tr>
     </w:tbl>
     <w:p/>
     <w:p>
@@ -519,11 +551,7 @@
     </w:p>
     <w:p>
       <w:r>
-        <w:rPr>
-          <w:b w:val="0"/>
-          <w:i w:val="0"/>
-        </w:rPr>
-        <w:t>Contact details, the student's grade (Play Group through Grade 12, or Bachelor Level), subject, location down to the ward level, exact address (kept private), and availability. No account created.</w:t>
+        <w:t>Families can submit tuition requests for one or multiple children in a single unified submission. For each child, the parent specifies their grade level (Play Group through Grade 12, or Bachelor Level — which captures their specific degree program and current year/semester) and subjects using a flexible multi-select picker (catalog subjects, custom subjects, or "All Subjects"). The form also captures tutor gender preference (Male, Female, or No Preference), day-range availability (e.g. Sunday to Friday, 5:00 PM – 7:00 PM), and location down to the municipality and ward level. The exact home address and contact phone number are collected securely and kept private from public and tutor browsing. No account creation is required.</w:t>
       </w:r>
     </w:p>
     <w:p>
@@ -573,11 +601,7 @@
     </w:p>
     <w:p>
       <w:r>
-        <w:rPr>
-          <w:b w:val="0"/>
-          <w:i w:val="0"/>
-        </w:rPr>
-        <w:t>The opportunity appears in every verified tutor's list. A tutor slightly outside the area can still apply — location filters, but never blocks. The parent's exact address is not shown to tutors at this stage.</w:t>
+        <w:t>The opportunity appears in Available Tuitions, automatically scoped to the tutor's own branch city so tutors only see jobs in their reachable area. Location filters default to the tutor's preferred locality. At this stage, tutors see only general area information (e.g. "Devichowk, Janakpur"); the parent's exact home address and contact details remain strictly hidden.</w:t>
       </w:r>
     </w:p>
     <w:p>
@@ -609,11 +633,7 @@
     </w:p>
     <w:p>
       <w:r>
-        <w:rPr>
-          <w:b w:val="0"/>
-          <w:i w:val="0"/>
-        </w:rPr>
-        <w:t>Both the admin and the assigned tutor see it as active.</w:t>
+        <w:t>Both the admin and the assigned tutor see the placement as active. Crucially, once formally assigned, the tutor's assignment screen reveals the parent's full contact name, phone number, and exact home address, providing the tutor with everything needed to contact the family and travel to conduct classes.</w:t>
       </w:r>
     </w:p>
     <w:p>
@@ -627,11 +647,7 @@
     </w:p>
     <w:p>
       <w:r>
-        <w:rPr>
-          <w:b w:val="0"/>
-          <w:i w:val="0"/>
-        </w:rPr>
-        <w:t>A tutor who can no longer continue submits a withdrawal request with a reason; an admin approves or rejects it. On approval, the admin can reopen the tuition for new applications.</w:t>
+        <w:t>A tutor who can no longer continue submits a withdrawal request with an explanatory reason; an admin reviews and approves or rejects it. On approval, the admin has two choices: they can either Reopen the tuition for fresh tutor applications, or Cancel Tuition (with a mandatory reason) if the family decides not to continue. Cancelled tuitions move to a dedicated Cancelled queue and remain on file permanently for audit records.</w:t>
       </w:r>
     </w:p>
     <w:p>
@@ -670,6 +686,19 @@
       </w:r>
       <w:r>
         <w:t xml:space="preserve"> creates a school partnership enquiry exactly as if the school had used the For Schools page themselves.</w:t>
+      </w:r>
+    </w:p>
+    <w:p>
+      <w:pPr>
+        <w:pStyle w:val="Heading3"/>
+      </w:pPr>
+      <w:r>
+        <w:t>Posting School Vacancies</w:t>
+      </w:r>
+    </w:p>
+    <w:p>
+      <w:r>
+        <w:t>In addition to home tuitions, institutions often contact Tuition Serve to recruit teachers. Admins can post school vacancies directly via Tuition Requests → Post School Vacancy. These vacancies flow through the same pipeline as home tuitions (New → Open → Applications → Assignment) and appear in tutors' Available Tuitions feed with a distinctive "School" badge, allowing tutors to apply for institutional classroom positions alongside private home tuitions.</w:t>
       </w:r>
     </w:p>
     <w:p>
@@ -1009,6 +1038,19 @@
         <w:pStyle w:val="Heading3"/>
       </w:pPr>
       <w:r>
+        <w:t>Tracking Applications and Mobile Navigation</w:t>
+      </w:r>
+    </w:p>
+    <w:p>
+      <w:r>
+        <w:t>Tutors track all active and past applications in My Applications, categorized into clear status tabs: All, Assigned, Applied, Not Selected, and Withdrawn. For administrators using mobile phones, the bottom tab bar features a "More" menu that opens a sliding drawer for one-tap access to all administrative actions (Post Tuition, Post School Vacancy, School Contact, Branches, Profile, and Sign Out).</w:t>
+      </w:r>
+    </w:p>
+    <w:p>
+      <w:pPr>
+        <w:pStyle w:val="Heading3"/>
+      </w:pPr>
+      <w:r>
         <w:t>Contact Queries and School Enquiries</w:t>
       </w:r>
     </w:p>
@@ -1203,11 +1245,7 @@
     <w:p/>
     <w:p>
       <w:r>
-        <w:rPr>
-          <w:b w:val="0"/>
-          <w:i w:val="0"/>
-        </w:rPr>
-        <w:t>There is deliberately no self-service way for anyone to make themselves a Branch Admin or Super Admin through the website — the public sign-up screen can only ever produce a Tutor account. This is a security decision, not an oversight: it means the only way someone becomes an admin is because you (or your developer) made a specific decision to grant it, either by running a setup command for a brand-new admin (Chapter 10) or by editing an existing account's role directly (Chapter 9).</w:t>
+        <w:t>There is deliberately no self-service way for anyone to make themselves a Branch Admin or Super Admin through the website — the public sign-up screen can only ever produce a Tutor account. This is a security decision, not an oversight: it means the only way someone becomes an admin is because you (or your developer) made a specific decision to grant it, either by having a Super Admin create their admin account (Chapter 10) or by editing an existing account's role directly (Chapter 9).</w:t>
       </w:r>
     </w:p>
     <w:p>
@@ -1598,20 +1636,12 @@
     </w:p>
     <w:p>
       <w:r>
-        <w:rPr>
-          <w:b w:val="0"/>
-          <w:i w:val="0"/>
-        </w:rPr>
-        <w:t>Chapter 9 covers changing an existing account's role. This is different: it's for someone who has never had any account in the system before and needs a Branch Admin or Super Admin login created from nothing — including their password.</w:t>
+        <w:t>Chapter 9 covers changing an existing account's role. This chapter covers creating a brand-new administrator account from scratch — including their branch assignment and initial password.</w:t>
       </w:r>
     </w:p>
     <w:p>
       <w:r>
-        <w:rPr>
-          <w:b w:val="0"/>
-          <w:i w:val="0"/>
-        </w:rPr>
-        <w:t>This cannot be done by editing the database, because it also needs to create their actual login identity (their password), which only happens through a setup command. This is something a developer runs for you (or that you can run yourself if you're comfortable in a terminal):</w:t>
+        <w:t>Super Admins can provision new Branch Admins directly from within the web application, with built-in security protections:</w:t>
       </w:r>
     </w:p>
     <w:p>
@@ -1620,22 +1650,26 @@
         <w:shd w:fill="F1F5F9"/>
       </w:pPr>
       <w:r>
-        <w:rPr>
-          <w:rFonts w:ascii="Consolas" w:hAnsi="Consolas"/>
-          <w:color w:val="0F172A"/>
-          <w:sz w:val="20"/>
-        </w:rPr>
-        <w:t>pnpm provision-admin --role=SUPER_ADMIN --email=name@example.com \</w:t>
+        <w:t>1. In-Dashboard Creation (Super Admin):</w:t>
         <w:br/>
-        <w:t xml:space="preserve">    --password=... --name="Their Name"</w:t>
+        <w:t>• Sign in as Super Admin and navigate to Admin → Admins in the sidebar (or via the "More" menu on mobile).</w:t>
+        <w:br/>
+        <w:t>• Click "Add Admin".</w:t>
+        <w:br/>
+        <w:t>• Enter the new admin's Full Name and Email address.</w:t>
+        <w:br/>
+        <w:t>• Under Branch, select an existing branch from the dropdown, or choose "+ Create a new branch..." to enter a new Branch Name and Branch City right there (the new branch is created alongside the admin account).</w:t>
+        <w:br/>
+        <w:t>• Click "Create Admin".</w:t>
+        <w:br/>
+        <w:t>• A secure, system-generated temporary password is shown on screen. Copy and provide this password to the new administrator.</w:t>
       </w:r>
     </w:p>
     <w:p>
       <w:r>
-        <w:rPr>
-          <w:b w:val="0"/>
-          <w:i w:val="0"/>
-        </w:rPr>
+        <w:t>2. Forced Password Change on First Login:</w:t>
+        <w:br/>
+        <w:t>The temporary password only grants access to a mandatory first-login screen (/change-password-required). The new admin cannot access the admin dashboard or any system data until they choose and confirm their own permanent password. Once submitted, their session is updated immediately and they enter their branch dashboard.</w:t>
       </w:r>
     </w:p>
     <w:p>
@@ -1644,25 +1678,18 @@
         <w:shd w:fill="F1F5F9"/>
       </w:pPr>
       <w:r>
-        <w:rPr>
-          <w:rFonts w:ascii="Consolas" w:hAnsi="Consolas"/>
-          <w:color w:val="0F172A"/>
-          <w:sz w:val="20"/>
-        </w:rPr>
-        <w:t>pnpm provision-admin --role=BRANCH_ADMIN --email=name@example.com \</w:t>
+        <w:t>3. Command-Line Setup (For Developers):</w:t>
         <w:br/>
-        <w:t xml:space="preserve">    --password=... --name="Their Name" \</w:t>
+        <w:t>The terminal provisioning script remains available for developers during initial server deployment or out-of-band setup:</w:t>
         <w:br/>
-        <w:t xml:space="preserve">    --branch-name="Pokhara" --branch-city="Pokhara"</w:t>
+        <w:t>pnpm provision-admin --role=SUPER_ADMIN --email=name@example.com --password=... --name="Their Name"</w:t>
+        <w:br/>
+        <w:t>pnpm provision-admin --role=BRANCH_ADMIN --email=name@example.com --password=... --name="Their Name" --branch-name="Pokhara" --branch-city="Pokhara"</w:t>
       </w:r>
     </w:p>
     <w:p>
       <w:r>
-        <w:rPr>
-          <w:b w:val="0"/>
-          <w:i w:val="0"/>
-        </w:rPr>
-        <w:t>The Branch Admin version also creates the branch itself if it doesn't already exist, using the name you give it. There's no in-app screen for this on purpose — every new admin account existing only because someone deliberately ran this command is the security model.</w:t>
+        <w:t>As with in-dashboard creation, any admin provisioned via CLI is also required to update their password on first sign-in. Public website sign-up can only ever create Tutor accounts; only an existing Super Admin or server CLI can create administrators.</w:t>
       </w:r>
     </w:p>
     <w:p>
@@ -1997,6 +2024,70 @@
           </w:p>
         </w:tc>
       </w:tr>
+      <w:tr>
+        <w:tc>
+          <w:tcPr>
+            <w:tcW w:type="dxa" w:w="2880"/>
+          </w:tcPr>
+          <w:p>
+            <w:r>
+              <w:t>TS-CQ-</w:t>
+            </w:r>
+          </w:p>
+        </w:tc>
+        <w:tc>
+          <w:tcPr>
+            <w:tcW w:type="dxa" w:w="2880"/>
+          </w:tcPr>
+          <w:p>
+            <w:r>
+              <w:t>A public contact inquiry</w:t>
+            </w:r>
+          </w:p>
+        </w:tc>
+        <w:tc>
+          <w:tcPr>
+            <w:tcW w:type="dxa" w:w="2880"/>
+          </w:tcPr>
+          <w:p>
+            <w:r>
+              <w:t>TS-CQ-000012</w:t>
+            </w:r>
+          </w:p>
+        </w:tc>
+      </w:tr>
+      <w:tr>
+        <w:tc>
+          <w:tcPr>
+            <w:tcW w:type="dxa" w:w="2880"/>
+          </w:tcPr>
+          <w:p>
+            <w:r>
+              <w:t>TS-SC-</w:t>
+            </w:r>
+          </w:p>
+        </w:tc>
+        <w:tc>
+          <w:tcPr>
+            <w:tcW w:type="dxa" w:w="2880"/>
+          </w:tcPr>
+          <w:p>
+            <w:r>
+              <w:t>A school partnership enquiry</w:t>
+            </w:r>
+          </w:p>
+        </w:tc>
+        <w:tc>
+          <w:tcPr>
+            <w:tcW w:type="dxa" w:w="2880"/>
+          </w:tcPr>
+          <w:p>
+            <w:r>
+              <w:t>TS-SC-000008</w:t>
+            </w:r>
+          </w:p>
+        </w:tc>
+      </w:tr>
     </w:tbl>
     <w:p/>
     <w:p>
@@ -2053,13 +2144,7 @@
         <w:pStyle w:val="ListBullet"/>
       </w:pPr>
       <w:r>
-        <w:rPr>
-          <w:b/>
-        </w:rPr>
-        <w:t xml:space="preserve">Exact addresses are private. </w:t>
-      </w:r>
-      <w:r>
-        <w:t>A parent's exact home address is only ever visible to an admin. Tutors only ever see a general area name — confirmed by directly attempting to read it through every tutor-facing page and request; it never appears.</w:t>
+        <w:t>Exact addresses are private until assignment. A parent's exact home address and contact phone number are hidden from tutors browsing opportunities (tutors see only the general locality and branch city). Once an admin formally assigns a tutor to that tuition, the assigned tutor is granted access to the exact address and parent contact details needed to teach. If the tuition is reopened or cancelled, this access is revoked.</w:t>
       </w:r>
     </w:p>
     <w:p>
@@ -2067,13 +2152,7 @@
         <w:pStyle w:val="ListBullet"/>
       </w:pPr>
       <w:r>
-        <w:rPr>
-          <w:b/>
-        </w:rPr>
-        <w:t xml:space="preserve">Branch data is isolated. </w:t>
-      </w:r>
-      <w:r>
-        <w:t>A Branch Admin cannot view, message, approve, reject, assign, or suspend anything belonging to another branch, even by directly editing a web address to try to guess at another branch's records — tested live and confirmed blocked, every time.</w:t>
+        <w:t>Branch data and opportunities are isolated. A Branch Admin cannot view, message, approve, reject, assign, or suspend anything belonging to another branch — tested live and confirmed blocked, every time. Furthermore, Available Tuitions are strictly scoped to the tutor's own branch city.</w:t>
       </w:r>
     </w:p>
     <w:p>
@@ -2144,6 +2223,14 @@
       </w:r>
       <w:r>
         <w:t>Uploaded CVs and photos are checked against their actual file content, not just the label the browser sent — this specifically closes a known trick where a harmful file is disguised with a “.pdf” name to fool a human reviewer.</w:t>
+      </w:r>
+    </w:p>
+    <w:p>
+      <w:pPr>
+        <w:pStyle w:val="ListBullet"/>
+      </w:pPr>
+      <w:r>
+        <w:t>Intrusion attempts are blocked and audited. Anyone attempting to snoop on admin-only routes (/admin/*) without authorization — whether an unauthenticated visitor or a registered tutor — is immediately blocked, redirected to a dedicated /access-denied warning page, and an UNAUTHORIZED_ADMIN_ACCESS_ATTEMPT security event is written to the audit log.</w:t>
       </w:r>
     </w:p>
     <w:p>

</xml_diff>